<commit_message>
Add S3 emulator verification (dvc push/pull) to report
Co-Authored-By: Claude Opus 5.5 <noreply@anthropic.com>
Claude-Session: https://claude.ai/code/session_01HRkfeCfFCKbncFXuB5Sxq8
</commit_message>
<xml_diff>
--- a/report/Project_Report.docx
+++ b/report/Project_Report.docx
@@ -2702,7 +2702,7 @@
     </w:p>
     <w:bookmarkEnd w:id="40"/>
     <w:bookmarkEnd w:id="41"/>
-    <w:bookmarkStart w:id="47" w:name="step-3-aws-s3-as-dvc-remote-storage"/>
+    <w:bookmarkStart w:id="66" w:name="step-3-aws-s3-as-dvc-remote-storage"/>
     <w:p>
       <w:pPr>
         <w:pStyle w:val="Heading1"/>
@@ -3022,7 +3022,7 @@
       <w:r>
         <w:drawing>
           <wp:inline>
-            <wp:extent cx="5334000" cy="2133600"/>
+            <wp:extent cx="5334000" cy="1666875"/>
             <wp:effectExtent b="0" l="0" r="0" t="0"/>
             <wp:docPr descr="S3 configured as the default DVC remote" title="" id="44" name="Picture"/>
             <a:graphic>
@@ -3043,7 +3043,7 @@
                   <pic:spPr bwMode="auto">
                     <a:xfrm>
                       <a:off x="0" y="0"/>
-                      <a:ext cx="5334000" cy="2133600"/>
+                      <a:ext cx="5334000" cy="1666875"/>
                     </a:xfrm>
                     <a:prstGeom prst="rect">
                       <a:avLst/>
@@ -3203,8 +3203,561 @@
       </w:r>
     </w:p>
     <w:bookmarkEnd w:id="46"/>
-    <w:bookmarkEnd w:id="47"/>
-    <w:bookmarkStart w:id="51" w:name="step-4-automated-tests-test.py"/>
+    <w:bookmarkStart w:id="65" w:name="verification-against-a-local-s3-emulator"/>
+    <w:p>
+      <w:pPr>
+        <w:pStyle w:val="Heading2"/>
+      </w:pPr>
+      <w:r>
+        <w:t xml:space="preserve">4.3 Verification against a local S3 emulator</w:t>
+      </w:r>
+    </w:p>
+    <w:p>
+      <w:pPr>
+        <w:pStyle w:val="FirstParagraph"/>
+      </w:pPr>
+      <w:r>
+        <w:t xml:space="preserve">The S3 workflow was also tested end to end against</w:t>
+      </w:r>
+      <w:r>
+        <w:t xml:space="preserve"> </w:t>
+      </w:r>
+      <w:r>
+        <w:rPr>
+          <w:bCs/>
+          <w:b/>
+        </w:rPr>
+        <w:t xml:space="preserve">moto</w:t>
+      </w:r>
+      <w:r>
+        <w:t xml:space="preserve">, a local server that implements</w:t>
+      </w:r>
+      <w:r>
+        <w:t xml:space="preserve"> </w:t>
+      </w:r>
+      <w:r>
+        <w:t xml:space="preserve">the S3 API, before AWS credentials were available. The</w:t>
+      </w:r>
+      <w:r>
+        <w:t xml:space="preserve"> </w:t>
+      </w:r>
+      <w:r>
+        <w:rPr>
+          <w:rStyle w:val="VerbatimChar"/>
+        </w:rPr>
+        <w:t xml:space="preserve">aws</w:t>
+      </w:r>
+      <w:r>
+        <w:t xml:space="preserve"> </w:t>
+      </w:r>
+      <w:r>
+        <w:t xml:space="preserve">and</w:t>
+      </w:r>
+      <w:r>
+        <w:t xml:space="preserve"> </w:t>
+      </w:r>
+      <w:r>
+        <w:rPr>
+          <w:rStyle w:val="VerbatimChar"/>
+        </w:rPr>
+        <w:t xml:space="preserve">dvc</w:t>
+      </w:r>
+      <w:r>
+        <w:t xml:space="preserve"> </w:t>
+      </w:r>
+      <w:r>
+        <w:t xml:space="preserve">commands are the same</w:t>
+      </w:r>
+      <w:r>
+        <w:t xml:space="preserve"> </w:t>
+      </w:r>
+      <w:r>
+        <w:t xml:space="preserve">as for real S3, except for the</w:t>
+      </w:r>
+      <w:r>
+        <w:t xml:space="preserve"> </w:t>
+      </w:r>
+      <w:r>
+        <w:rPr>
+          <w:rStyle w:val="VerbatimChar"/>
+        </w:rPr>
+        <w:t xml:space="preserve">--endpoint-url</w:t>
+      </w:r>
+      <w:r>
+        <w:t xml:space="preserve"> </w:t>
+      </w:r>
+      <w:r>
+        <w:t xml:space="preserve">/</w:t>
+      </w:r>
+      <w:r>
+        <w:t xml:space="preserve"> </w:t>
+      </w:r>
+      <w:r>
+        <w:rPr>
+          <w:rStyle w:val="VerbatimChar"/>
+        </w:rPr>
+        <w:t xml:space="preserve">endpointurl</w:t>
+      </w:r>
+      <w:r>
+        <w:t xml:space="preserve"> </w:t>
+      </w:r>
+      <w:r>
+        <w:t xml:space="preserve">setting. Every screenshot in</w:t>
+      </w:r>
+      <w:r>
+        <w:t xml:space="preserve"> </w:t>
+      </w:r>
+      <w:r>
+        <w:t xml:space="preserve">this subsection is labeled</w:t>
+      </w:r>
+      <w:r>
+        <w:t xml:space="preserve"> </w:t>
+      </w:r>
+      <w:r>
+        <w:rPr>
+          <w:iCs/>
+          <w:i/>
+        </w:rPr>
+        <w:t xml:space="preserve">LOCAL S3 EMULATOR (moto), not real AWS</w:t>
+      </w:r>
+      <w:r>
+        <w:t xml:space="preserve">.</w:t>
+      </w:r>
+    </w:p>
+    <w:p>
+      <w:pPr>
+        <w:pStyle w:val="CaptionedFigure"/>
+      </w:pPr>
+      <w:r>
+        <w:drawing>
+          <wp:inline>
+            <wp:extent cx="5334000" cy="1968246"/>
+            <wp:effectExtent b="0" l="0" r="0" t="0"/>
+            <wp:docPr descr="AWS CLI configured (emulator credentials)" title="" id="48" name="Picture"/>
+            <a:graphic>
+              <a:graphicData uri="http://schemas.openxmlformats.org/drawingml/2006/picture">
+                <pic:pic>
+                  <pic:nvPicPr>
+                    <pic:cNvPr descr="../screenshots/12_s3emu_aws_cli.png" id="49" name="Picture"/>
+                    <pic:cNvPicPr>
+                      <a:picLocks noChangeArrowheads="1" noChangeAspect="1"/>
+                    </pic:cNvPicPr>
+                  </pic:nvPicPr>
+                  <pic:blipFill>
+                    <a:blip r:embed="rId47"/>
+                    <a:stretch>
+                      <a:fillRect/>
+                    </a:stretch>
+                  </pic:blipFill>
+                  <pic:spPr bwMode="auto">
+                    <a:xfrm>
+                      <a:off x="0" y="0"/>
+                      <a:ext cx="5334000" cy="1968246"/>
+                    </a:xfrm>
+                    <a:prstGeom prst="rect">
+                      <a:avLst/>
+                    </a:prstGeom>
+                    <a:noFill/>
+                    <a:ln w="9525">
+                      <a:noFill/>
+                      <a:headEnd/>
+                      <a:tailEnd/>
+                    </a:ln>
+                  </pic:spPr>
+                </pic:pic>
+              </a:graphicData>
+            </a:graphic>
+          </wp:inline>
+        </w:drawing>
+      </w:r>
+    </w:p>
+    <w:p>
+      <w:pPr>
+        <w:pStyle w:val="ImageCaption"/>
+      </w:pPr>
+      <w:r>
+        <w:t xml:space="preserve">AWS CLI configured (emulator credentials)</w:t>
+      </w:r>
+    </w:p>
+    <w:p>
+      <w:pPr>
+        <w:pStyle w:val="CaptionedFigure"/>
+      </w:pPr>
+      <w:r>
+        <w:drawing>
+          <wp:inline>
+            <wp:extent cx="5334000" cy="760095"/>
+            <wp:effectExtent b="0" l="0" r="0" t="0"/>
+            <wp:docPr descr="Bucket created with aws s3 mb" title="" id="51" name="Picture"/>
+            <a:graphic>
+              <a:graphicData uri="http://schemas.openxmlformats.org/drawingml/2006/picture">
+                <pic:pic>
+                  <pic:nvPicPr>
+                    <pic:cNvPr descr="../screenshots/13_s3emu_create_bucket.png" id="52" name="Picture"/>
+                    <pic:cNvPicPr>
+                      <a:picLocks noChangeArrowheads="1" noChangeAspect="1"/>
+                    </pic:cNvPicPr>
+                  </pic:nvPicPr>
+                  <pic:blipFill>
+                    <a:blip r:embed="rId50"/>
+                    <a:stretch>
+                      <a:fillRect/>
+                    </a:stretch>
+                  </pic:blipFill>
+                  <pic:spPr bwMode="auto">
+                    <a:xfrm>
+                      <a:off x="0" y="0"/>
+                      <a:ext cx="5334000" cy="760095"/>
+                    </a:xfrm>
+                    <a:prstGeom prst="rect">
+                      <a:avLst/>
+                    </a:prstGeom>
+                    <a:noFill/>
+                    <a:ln w="9525">
+                      <a:noFill/>
+                      <a:headEnd/>
+                      <a:tailEnd/>
+                    </a:ln>
+                  </pic:spPr>
+                </pic:pic>
+              </a:graphicData>
+            </a:graphic>
+          </wp:inline>
+        </w:drawing>
+      </w:r>
+    </w:p>
+    <w:p>
+      <w:pPr>
+        <w:pStyle w:val="ImageCaption"/>
+      </w:pPr>
+      <w:r>
+        <w:t xml:space="preserve">Bucket created with</w:t>
+      </w:r>
+      <w:r>
+        <w:t xml:space="preserve"> </w:t>
+      </w:r>
+      <w:r>
+        <w:rPr>
+          <w:rStyle w:val="VerbatimChar"/>
+        </w:rPr>
+        <w:t xml:space="preserve">aws s3 mb</w:t>
+      </w:r>
+    </w:p>
+    <w:p>
+      <w:pPr>
+        <w:pStyle w:val="CaptionedFigure"/>
+      </w:pPr>
+      <w:r>
+        <w:drawing>
+          <wp:inline>
+            <wp:extent cx="5334000" cy="962787"/>
+            <wp:effectExtent b="0" l="0" r="0" t="0"/>
+            <wp:docPr descr="S3 remote added for DVC" title="" id="54" name="Picture"/>
+            <a:graphic>
+              <a:graphicData uri="http://schemas.openxmlformats.org/drawingml/2006/picture">
+                <pic:pic>
+                  <pic:nvPicPr>
+                    <pic:cNvPr descr="../screenshots/14_s3emu_dvc_remote.png" id="55" name="Picture"/>
+                    <pic:cNvPicPr>
+                      <a:picLocks noChangeArrowheads="1" noChangeAspect="1"/>
+                    </pic:cNvPicPr>
+                  </pic:nvPicPr>
+                  <pic:blipFill>
+                    <a:blip r:embed="rId53"/>
+                    <a:stretch>
+                      <a:fillRect/>
+                    </a:stretch>
+                  </pic:blipFill>
+                  <pic:spPr bwMode="auto">
+                    <a:xfrm>
+                      <a:off x="0" y="0"/>
+                      <a:ext cx="5334000" cy="962787"/>
+                    </a:xfrm>
+                    <a:prstGeom prst="rect">
+                      <a:avLst/>
+                    </a:prstGeom>
+                    <a:noFill/>
+                    <a:ln w="9525">
+                      <a:noFill/>
+                      <a:headEnd/>
+                      <a:tailEnd/>
+                    </a:ln>
+                  </pic:spPr>
+                </pic:pic>
+              </a:graphicData>
+            </a:graphic>
+          </wp:inline>
+        </w:drawing>
+      </w:r>
+    </w:p>
+    <w:p>
+      <w:pPr>
+        <w:pStyle w:val="ImageCaption"/>
+      </w:pPr>
+      <w:r>
+        <w:t xml:space="preserve">S3 remote added for DVC</w:t>
+      </w:r>
+    </w:p>
+    <w:p>
+      <w:pPr>
+        <w:pStyle w:val="CaptionedFigure"/>
+      </w:pPr>
+      <w:r>
+        <w:drawing>
+          <wp:inline>
+            <wp:extent cx="5334000" cy="760095"/>
+            <wp:effectExtent b="0" l="0" r="0" t="0"/>
+            <wp:docPr descr="dvc push: 1,802 files uploaded (1,797 images, processed data, model)" title="" id="57" name="Picture"/>
+            <a:graphic>
+              <a:graphicData uri="http://schemas.openxmlformats.org/drawingml/2006/picture">
+                <pic:pic>
+                  <pic:nvPicPr>
+                    <pic:cNvPr descr="../screenshots/15_s3emu_dvc_push.png" id="58" name="Picture"/>
+                    <pic:cNvPicPr>
+                      <a:picLocks noChangeArrowheads="1" noChangeAspect="1"/>
+                    </pic:cNvPicPr>
+                  </pic:nvPicPr>
+                  <pic:blipFill>
+                    <a:blip r:embed="rId56"/>
+                    <a:stretch>
+                      <a:fillRect/>
+                    </a:stretch>
+                  </pic:blipFill>
+                  <pic:spPr bwMode="auto">
+                    <a:xfrm>
+                      <a:off x="0" y="0"/>
+                      <a:ext cx="5334000" cy="760095"/>
+                    </a:xfrm>
+                    <a:prstGeom prst="rect">
+                      <a:avLst/>
+                    </a:prstGeom>
+                    <a:noFill/>
+                    <a:ln w="9525">
+                      <a:noFill/>
+                      <a:headEnd/>
+                      <a:tailEnd/>
+                    </a:ln>
+                  </pic:spPr>
+                </pic:pic>
+              </a:graphicData>
+            </a:graphic>
+          </wp:inline>
+        </w:drawing>
+      </w:r>
+    </w:p>
+    <w:p>
+      <w:pPr>
+        <w:pStyle w:val="ImageCaption"/>
+      </w:pPr>
+      <w:r>
+        <w:rPr>
+          <w:rStyle w:val="VerbatimChar"/>
+        </w:rPr>
+        <w:t xml:space="preserve">dvc push</w:t>
+      </w:r>
+      <w:r>
+        <w:t xml:space="preserve">: 1,802 files uploaded (1,797 images, processed data, model)</w:t>
+      </w:r>
+    </w:p>
+    <w:p>
+      <w:pPr>
+        <w:pStyle w:val="CaptionedFigure"/>
+      </w:pPr>
+      <w:r>
+        <w:drawing>
+          <wp:inline>
+            <wp:extent cx="5334000" cy="1653540"/>
+            <wp:effectExtent b="0" l="0" r="0" t="0"/>
+            <wp:docPr descr="Bucket contents: the model object key matches its MD5 hash in dvc.lock" title="" id="60" name="Picture"/>
+            <a:graphic>
+              <a:graphicData uri="http://schemas.openxmlformats.org/drawingml/2006/picture">
+                <pic:pic>
+                  <pic:nvPicPr>
+                    <pic:cNvPr descr="../screenshots/16_s3emu_bucket_contents.png" id="61" name="Picture"/>
+                    <pic:cNvPicPr>
+                      <a:picLocks noChangeArrowheads="1" noChangeAspect="1"/>
+                    </pic:cNvPicPr>
+                  </pic:nvPicPr>
+                  <pic:blipFill>
+                    <a:blip r:embed="rId59"/>
+                    <a:stretch>
+                      <a:fillRect/>
+                    </a:stretch>
+                  </pic:blipFill>
+                  <pic:spPr bwMode="auto">
+                    <a:xfrm>
+                      <a:off x="0" y="0"/>
+                      <a:ext cx="5334000" cy="1653540"/>
+                    </a:xfrm>
+                    <a:prstGeom prst="rect">
+                      <a:avLst/>
+                    </a:prstGeom>
+                    <a:noFill/>
+                    <a:ln w="9525">
+                      <a:noFill/>
+                      <a:headEnd/>
+                      <a:tailEnd/>
+                    </a:ln>
+                  </pic:spPr>
+                </pic:pic>
+              </a:graphicData>
+            </a:graphic>
+          </wp:inline>
+        </w:drawing>
+      </w:r>
+    </w:p>
+    <w:p>
+      <w:pPr>
+        <w:pStyle w:val="ImageCaption"/>
+      </w:pPr>
+      <w:r>
+        <w:t xml:space="preserve">Bucket contents: the model object key matches its MD5 hash in</w:t>
+      </w:r>
+      <w:r>
+        <w:t xml:space="preserve"> </w:t>
+      </w:r>
+      <w:r>
+        <w:rPr>
+          <w:rStyle w:val="VerbatimChar"/>
+        </w:rPr>
+        <w:t xml:space="preserve">dvc.lock</w:t>
+      </w:r>
+    </w:p>
+    <w:p>
+      <w:pPr>
+        <w:pStyle w:val="CaptionedFigure"/>
+      </w:pPr>
+      <w:r>
+        <w:drawing>
+          <wp:inline>
+            <wp:extent cx="5334000" cy="2378964"/>
+            <wp:effectExtent b="0" l="0" r="0" t="0"/>
+            <wp:docPr descr="Restore test: local data, model and cache deleted, then recovered with dvc pull" title="" id="63" name="Picture"/>
+            <a:graphic>
+              <a:graphicData uri="http://schemas.openxmlformats.org/drawingml/2006/picture">
+                <pic:pic>
+                  <pic:nvPicPr>
+                    <pic:cNvPr descr="../screenshots/17_s3emu_dvc_pull_restore.png" id="64" name="Picture"/>
+                    <pic:cNvPicPr>
+                      <a:picLocks noChangeArrowheads="1" noChangeAspect="1"/>
+                    </pic:cNvPicPr>
+                  </pic:nvPicPr>
+                  <pic:blipFill>
+                    <a:blip r:embed="rId62"/>
+                    <a:stretch>
+                      <a:fillRect/>
+                    </a:stretch>
+                  </pic:blipFill>
+                  <pic:spPr bwMode="auto">
+                    <a:xfrm>
+                      <a:off x="0" y="0"/>
+                      <a:ext cx="5334000" cy="2378964"/>
+                    </a:xfrm>
+                    <a:prstGeom prst="rect">
+                      <a:avLst/>
+                    </a:prstGeom>
+                    <a:noFill/>
+                    <a:ln w="9525">
+                      <a:noFill/>
+                      <a:headEnd/>
+                      <a:tailEnd/>
+                    </a:ln>
+                  </pic:spPr>
+                </pic:pic>
+              </a:graphicData>
+            </a:graphic>
+          </wp:inline>
+        </w:drawing>
+      </w:r>
+    </w:p>
+    <w:p>
+      <w:pPr>
+        <w:pStyle w:val="ImageCaption"/>
+      </w:pPr>
+      <w:r>
+        <w:t xml:space="preserve">Restore test: local data, model and cache deleted, then recovered with</w:t>
+      </w:r>
+      <w:r>
+        <w:t xml:space="preserve"> </w:t>
+      </w:r>
+      <w:r>
+        <w:rPr>
+          <w:rStyle w:val="VerbatimChar"/>
+        </w:rPr>
+        <w:t xml:space="preserve">dvc pull</w:t>
+      </w:r>
+    </w:p>
+    <w:p>
+      <w:pPr>
+        <w:pStyle w:val="BodyText"/>
+      </w:pPr>
+      <w:r>
+        <w:t xml:space="preserve">The restore test confirms that the S3 remote holds everything needed to rebuild the</w:t>
+      </w:r>
+      <w:r>
+        <w:t xml:space="preserve"> </w:t>
+      </w:r>
+      <w:r>
+        <w:t xml:space="preserve">project state. After deleting</w:t>
+      </w:r>
+      <w:r>
+        <w:t xml:space="preserve"> </w:t>
+      </w:r>
+      <w:r>
+        <w:rPr>
+          <w:rStyle w:val="VerbatimChar"/>
+        </w:rPr>
+        <w:t xml:space="preserve">data/raw</w:t>
+      </w:r>
+      <w:r>
+        <w:t xml:space="preserve">,</w:t>
+      </w:r>
+      <w:r>
+        <w:t xml:space="preserve"> </w:t>
+      </w:r>
+      <w:r>
+        <w:rPr>
+          <w:rStyle w:val="VerbatimChar"/>
+        </w:rPr>
+        <w:t xml:space="preserve">data/processed</w:t>
+      </w:r>
+      <w:r>
+        <w:t xml:space="preserve">, the model and the DVC cache,</w:t>
+      </w:r>
+      <w:r>
+        <w:t xml:space="preserve"> </w:t>
+      </w:r>
+      <w:r>
+        <w:rPr>
+          <w:rStyle w:val="VerbatimChar"/>
+        </w:rPr>
+        <w:t xml:space="preserve">dvc pull</w:t>
+      </w:r>
+      <w:r>
+        <w:t xml:space="preserve"> </w:t>
+      </w:r>
+      <w:r>
+        <w:t xml:space="preserve">fetched all 1,802 files and</w:t>
+      </w:r>
+      <w:r>
+        <w:t xml:space="preserve"> </w:t>
+      </w:r>
+      <w:r>
+        <w:rPr>
+          <w:rStyle w:val="VerbatimChar"/>
+        </w:rPr>
+        <w:t xml:space="preserve">dvc status</w:t>
+      </w:r>
+      <w:r>
+        <w:t xml:space="preserve"> </w:t>
+      </w:r>
+      <w:r>
+        <w:t xml:space="preserve">reported the workspace up to date.</w:t>
+      </w:r>
+    </w:p>
+    <w:bookmarkEnd w:id="65"/>
+    <w:bookmarkEnd w:id="66"/>
+    <w:bookmarkStart w:id="70" w:name="step-4-automated-tests-test.py"/>
     <w:p>
       <w:pPr>
         <w:pStyle w:val="Heading1"/>
@@ -3470,18 +4023,18 @@
           <wp:inline>
             <wp:extent cx="5334000" cy="2480310"/>
             <wp:effectExtent b="0" l="0" r="0" t="0"/>
-            <wp:docPr descr="All 12 tests passing" title="" id="49" name="Picture"/>
+            <wp:docPr descr="All 12 tests passing" title="" id="68" name="Picture"/>
             <a:graphic>
               <a:graphicData uri="http://schemas.openxmlformats.org/drawingml/2006/picture">
                 <pic:pic>
                   <pic:nvPicPr>
-                    <pic:cNvPr descr="../screenshots/06_pytest.png" id="50" name="Picture"/>
+                    <pic:cNvPr descr="../screenshots/06_pytest.png" id="69" name="Picture"/>
                     <pic:cNvPicPr>
                       <a:picLocks noChangeArrowheads="1" noChangeAspect="1"/>
                     </pic:cNvPicPr>
                   </pic:nvPicPr>
                   <pic:blipFill>
-                    <a:blip r:embed="rId48"/>
+                    <a:blip r:embed="rId67"/>
                     <a:stretch>
                       <a:fillRect/>
                     </a:stretch>
@@ -3516,8 +4069,8 @@
         <w:t xml:space="preserve">All 12 tests passing</w:t>
       </w:r>
     </w:p>
-    <w:bookmarkEnd w:id="51"/>
-    <w:bookmarkStart w:id="58" w:name="step-5-docker"/>
+    <w:bookmarkEnd w:id="70"/>
+    <w:bookmarkStart w:id="77" w:name="step-5-docker"/>
     <w:p>
       <w:pPr>
         <w:pStyle w:val="Heading1"/>
@@ -4049,18 +4602,18 @@
           <wp:inline>
             <wp:extent cx="5334000" cy="2378964"/>
             <wp:effectExtent b="0" l="0" r="0" t="0"/>
-            <wp:docPr descr="Docker image build" title="" id="53" name="Picture"/>
+            <wp:docPr descr="Docker image build" title="" id="72" name="Picture"/>
             <a:graphic>
               <a:graphicData uri="http://schemas.openxmlformats.org/drawingml/2006/picture">
                 <pic:pic>
                   <pic:nvPicPr>
-                    <pic:cNvPr descr="../screenshots/07_docker_build.png" id="54" name="Picture"/>
+                    <pic:cNvPr descr="../screenshots/07_docker_build.png" id="73" name="Picture"/>
                     <pic:cNvPicPr>
                       <a:picLocks noChangeArrowheads="1" noChangeAspect="1"/>
                     </pic:cNvPicPr>
                   </pic:nvPicPr>
                   <pic:blipFill>
-                    <a:blip r:embed="rId52"/>
+                    <a:blip r:embed="rId71"/>
                     <a:stretch>
                       <a:fillRect/>
                     </a:stretch>
@@ -4104,18 +4657,18 @@
           <wp:inline>
             <wp:extent cx="5334000" cy="2176272"/>
             <wp:effectExtent b="0" l="0" r="0" t="0"/>
-            <wp:docPr descr="Running the container and calling the API" title="" id="56" name="Picture"/>
+            <wp:docPr descr="Running the container and calling the API" title="" id="75" name="Picture"/>
             <a:graphic>
               <a:graphicData uri="http://schemas.openxmlformats.org/drawingml/2006/picture">
                 <pic:pic>
                   <pic:nvPicPr>
-                    <pic:cNvPr descr="../screenshots/08_docker_run.png" id="57" name="Picture"/>
+                    <pic:cNvPr descr="../screenshots/08_docker_run.png" id="76" name="Picture"/>
                     <pic:cNvPicPr>
                       <a:picLocks noChangeArrowheads="1" noChangeAspect="1"/>
                     </pic:cNvPicPr>
                   </pic:nvPicPr>
                   <pic:blipFill>
-                    <a:blip r:embed="rId55"/>
+                    <a:blip r:embed="rId74"/>
                     <a:stretch>
                       <a:fillRect/>
                     </a:stretch>
@@ -4150,8 +4703,8 @@
         <w:t xml:space="preserve">Running the container and calling the API</w:t>
       </w:r>
     </w:p>
-    <w:bookmarkEnd w:id="58"/>
-    <w:bookmarkStart w:id="62" w:name="step-6-github-actions-cicd-ci-cd.yaml"/>
+    <w:bookmarkEnd w:id="77"/>
+    <w:bookmarkStart w:id="81" w:name="step-6-github-actions-cicd-ci-cd.yaml"/>
     <w:p>
       <w:pPr>
         <w:pStyle w:val="Heading1"/>
@@ -5048,18 +5601,18 @@
           <wp:inline>
             <wp:extent cx="5334000" cy="3883152"/>
             <wp:effectExtent b="0" l="0" r="0" t="0"/>
-            <wp:docPr descr="CI/CD run #1, from the GitHub API" title="" id="60" name="Picture"/>
+            <wp:docPr descr="CI/CD run #1, from the GitHub API" title="" id="79" name="Picture"/>
             <a:graphic>
               <a:graphicData uri="http://schemas.openxmlformats.org/drawingml/2006/picture">
                 <pic:pic>
                   <pic:nvPicPr>
-                    <pic:cNvPr descr="../screenshots/09_github_actions_cicd_run.png" id="61" name="Picture"/>
+                    <pic:cNvPr descr="../screenshots/09_github_actions_cicd_run.png" id="80" name="Picture"/>
                     <pic:cNvPicPr>
                       <a:picLocks noChangeArrowheads="1" noChangeAspect="1"/>
                     </pic:cNvPicPr>
                   </pic:nvPicPr>
                   <pic:blipFill>
-                    <a:blip r:embed="rId59"/>
+                    <a:blip r:embed="rId78"/>
                     <a:stretch>
                       <a:fillRect/>
                     </a:stretch>
@@ -5211,8 +5764,8 @@
         <w:t xml:space="preserve">job log</w:t>
       </w:r>
     </w:p>
-    <w:bookmarkEnd w:id="62"/>
-    <w:bookmarkStart w:id="65" w:name="step-7-aws-ec2-deployment"/>
+    <w:bookmarkEnd w:id="81"/>
+    <w:bookmarkStart w:id="84" w:name="step-7-aws-ec2-deployment"/>
     <w:p>
       <w:pPr>
         <w:pStyle w:val="Heading1"/>
@@ -5221,7 +5774,7 @@
         <w:t xml:space="preserve">8. Step 7: AWS EC2 deployment</w:t>
       </w:r>
     </w:p>
-    <w:bookmarkStart w:id="63" w:name="launch-the-instance"/>
+    <w:bookmarkStart w:id="82" w:name="launch-the-instance"/>
     <w:p>
       <w:pPr>
         <w:pStyle w:val="Heading2"/>
@@ -5557,8 +6110,8 @@
         <w:t xml:space="preserve">Security group inbound rules (22, 80)</w:t>
       </w:r>
     </w:p>
-    <w:bookmarkEnd w:id="63"/>
-    <w:bookmarkStart w:id="64" w:name="deploy"/>
+    <w:bookmarkEnd w:id="82"/>
+    <w:bookmarkStart w:id="83" w:name="deploy"/>
     <w:p>
       <w:pPr>
         <w:pStyle w:val="Heading2"/>
@@ -5742,9 +6295,9 @@
         <w:t xml:space="preserve">0.0.0.0:80-&gt;5000/tcp</w:t>
       </w:r>
     </w:p>
-    <w:bookmarkEnd w:id="64"/>
-    <w:bookmarkEnd w:id="65"/>
-    <w:bookmarkStart w:id="72" w:name="X1b6eb4221b86c9d567df62c16831da042e00bc3"/>
+    <w:bookmarkEnd w:id="83"/>
+    <w:bookmarkEnd w:id="84"/>
+    <w:bookmarkStart w:id="91" w:name="X1b6eb4221b86c9d567df62c16831da042e00bc3"/>
     <w:p>
       <w:pPr>
         <w:pStyle w:val="Heading1"/>
@@ -5888,18 +6441,18 @@
           <wp:inline>
             <wp:extent cx="5334000" cy="3491345"/>
             <wp:effectExtent b="0" l="0" r="0" t="0"/>
-            <wp:docPr descr="Web UI: hand-drawn “7” classified as 7" title="" id="67" name="Picture"/>
+            <wp:docPr descr="Web UI: hand-drawn “7” classified as 7" title="" id="86" name="Picture"/>
             <a:graphic>
               <a:graphicData uri="http://schemas.openxmlformats.org/drawingml/2006/picture">
                 <pic:pic>
                   <pic:nvPicPr>
-                    <pic:cNvPr descr="../screenshots/10_app_ui_draw_predict.png" id="68" name="Picture"/>
+                    <pic:cNvPr descr="../screenshots/10_app_ui_draw_predict.png" id="87" name="Picture"/>
                     <pic:cNvPicPr>
                       <a:picLocks noChangeArrowheads="1" noChangeAspect="1"/>
                     </pic:cNvPicPr>
                   </pic:nvPicPr>
                   <pic:blipFill>
-                    <a:blip r:embed="rId66"/>
+                    <a:blip r:embed="rId85"/>
                     <a:stretch>
                       <a:fillRect/>
                     </a:stretch>
@@ -5961,18 +6514,18 @@
           <wp:inline>
             <wp:extent cx="5334000" cy="3491345"/>
             <wp:effectExtent b="0" l="0" r="0" t="0"/>
-            <wp:docPr descr="Web UI: uploaded image classified as 2" title="" id="70" name="Picture"/>
+            <wp:docPr descr="Web UI: uploaded image classified as 2" title="" id="89" name="Picture"/>
             <a:graphic>
               <a:graphicData uri="http://schemas.openxmlformats.org/drawingml/2006/picture">
                 <pic:pic>
                   <pic:nvPicPr>
-                    <pic:cNvPr descr="../screenshots/11_app_ui_upload_predict.png" id="71" name="Picture"/>
+                    <pic:cNvPr descr="../screenshots/11_app_ui_upload_predict.png" id="90" name="Picture"/>
                     <pic:cNvPicPr>
                       <a:picLocks noChangeArrowheads="1" noChangeAspect="1"/>
                     </pic:cNvPicPr>
                   </pic:nvPicPr>
                   <pic:blipFill>
-                    <a:blip r:embed="rId69"/>
+                    <a:blip r:embed="rId88"/>
                     <a:stretch>
                       <a:fillRect/>
                     </a:stretch>
@@ -6104,8 +6657,8 @@
         <w:t xml:space="preserve">http://&lt;EC2-public-IP&gt;/</w:t>
       </w:r>
     </w:p>
-    <w:bookmarkEnd w:id="72"/>
-    <w:bookmarkStart w:id="73" w:name="challenges-and-solutions"/>
+    <w:bookmarkEnd w:id="91"/>
+    <w:bookmarkStart w:id="92" w:name="challenges-and-solutions"/>
     <w:p>
       <w:pPr>
         <w:pStyle w:val="Heading1"/>
@@ -6670,6 +7223,75 @@
                 <w:bCs/>
                 <w:b/>
               </w:rPr>
+              <w:t xml:space="preserve">S3 had to be tested before AWS credentials were available.</w:t>
+            </w:r>
+          </w:p>
+        </w:tc>
+        <w:tc>
+          <w:tcPr/>
+          <w:p>
+            <w:pPr>
+              <w:pStyle w:val="Compact"/>
+              <w:jc w:val="left"/>
+            </w:pPr>
+            <w:r>
+              <w:t xml:space="preserve">Ran the</w:t>
+            </w:r>
+            <w:r>
+              <w:t xml:space="preserve"> </w:t>
+            </w:r>
+            <w:r>
+              <w:rPr>
+                <w:rStyle w:val="VerbatimChar"/>
+              </w:rPr>
+              <w:t xml:space="preserve">aws s3</w:t>
+            </w:r>
+            <w:r>
+              <w:t xml:space="preserve"> </w:t>
+            </w:r>
+            <w:r>
+              <w:t xml:space="preserve">and</w:t>
+            </w:r>
+            <w:r>
+              <w:t xml:space="preserve"> </w:t>
+            </w:r>
+            <w:r>
+              <w:rPr>
+                <w:rStyle w:val="VerbatimChar"/>
+              </w:rPr>
+              <w:t xml:space="preserve">dvc push</w:t>
+            </w:r>
+            <w:r>
+              <w:t xml:space="preserve">/</w:t>
+            </w:r>
+            <w:r>
+              <w:rPr>
+                <w:rStyle w:val="VerbatimChar"/>
+              </w:rPr>
+              <w:t xml:space="preserve">pull</w:t>
+            </w:r>
+            <w:r>
+              <w:t xml:space="preserve"> </w:t>
+            </w:r>
+            <w:r>
+              <w:t xml:space="preserve">commands against moto, a local S3-compatible emulator (Section 4.3). Only the endpoint setting differs, so the same commands work on real S3.</w:t>
+            </w:r>
+          </w:p>
+        </w:tc>
+      </w:tr>
+      <w:tr>
+        <w:tc>
+          <w:tcPr/>
+          <w:p>
+            <w:pPr>
+              <w:pStyle w:val="Compact"/>
+              <w:jc w:val="left"/>
+            </w:pPr>
+            <w:r>
+              <w:rPr>
+                <w:bCs/>
+                <w:b/>
+              </w:rPr>
               <w:t xml:space="preserve">Deployment must be verifiable automatically.</w:t>
             </w:r>
           </w:p>
@@ -6715,8 +7337,8 @@
         </w:tc>
       </w:tr>
     </w:tbl>
-    <w:bookmarkEnd w:id="73"/>
-    <w:bookmarkStart w:id="74" w:name="conclusion"/>
+    <w:bookmarkEnd w:id="92"/>
+    <w:bookmarkStart w:id="93" w:name="conclusion"/>
     <w:p>
       <w:pPr>
         <w:pStyle w:val="Heading1"/>
@@ -6792,8 +7414,8 @@
         <w:t xml:space="preserve">carries a change through testing to production without manual steps.</w:t>
       </w:r>
     </w:p>
-    <w:bookmarkEnd w:id="74"/>
-    <w:bookmarkStart w:id="77" w:name="links"/>
+    <w:bookmarkEnd w:id="93"/>
+    <w:bookmarkStart w:id="96" w:name="links"/>
     <w:p>
       <w:pPr>
         <w:pStyle w:val="Heading1"/>
@@ -6820,7 +7442,7 @@
       <w:r>
         <w:t xml:space="preserve"> </w:t>
       </w:r>
-      <w:hyperlink r:id="rId75">
+      <w:hyperlink r:id="rId94">
         <w:r>
           <w:rPr>
             <w:rStyle w:val="Hyperlink"/>
@@ -6847,7 +7469,7 @@
       <w:r>
         <w:t xml:space="preserve"> </w:t>
       </w:r>
-      <w:hyperlink r:id="rId76">
+      <w:hyperlink r:id="rId95">
         <w:r>
           <w:rPr>
             <w:rStyle w:val="Hyperlink"/>
@@ -6906,7 +7528,7 @@
         <w:t xml:space="preserve">http://&lt;EC2-public-IP&gt;/</w:t>
       </w:r>
     </w:p>
-    <w:bookmarkEnd w:id="77"/>
+    <w:bookmarkEnd w:id="96"/>
     <w:sectPr/>
   </w:body>
 </w:document>

</xml_diff>